<commit_message>
finished deliverable 3 and updated unit testing code
</commit_message>
<xml_diff>
--- a/Deliverables/Deliverable 3 - Initial Prototype - Development Milestone by Ryan Beikrasouli.docx
+++ b/Deliverables/Deliverable 3 - Initial Prototype - Development Milestone by Ryan Beikrasouli.docx
@@ -24,7 +24,7 @@
           <w:noProof/>
         </w:rPr>
         <w:pict w14:anchorId="3FDA233D">
-          <v:rect id="_x0000_i1031" alt="" style="width:451.3pt;height:.05pt;mso-width-percent:0;mso-height-percent:0;mso-width-percent:0;mso-height-percent:0" o:hralign="center" o:hrstd="t" o:hr="t" fillcolor="#a0a0a0" stroked="f"/>
+          <v:rect id="_x0000_i1029" alt="" style="width:451.3pt;height:.05pt;mso-width-percent:0;mso-height-percent:0;mso-width-percent:0;mso-height-percent:0" o:hralign="center" o:hrstd="t" o:hr="t" fillcolor="#a0a0a0" stroked="f"/>
         </w:pict>
       </w:r>
     </w:p>
@@ -54,7 +54,15 @@
       </w:r>
       <w:proofErr w:type="spellEnd"/>
       <w:r>
-        <w:t xml:space="preserve"> project (e.g., update(), </w:t>
+        <w:t xml:space="preserve"> project (e.g., </w:t>
+      </w:r>
+      <w:proofErr w:type="gramStart"/>
+      <w:r>
+        <w:t>update(</w:t>
+      </w:r>
+      <w:proofErr w:type="gramEnd"/>
+      <w:r>
+        <w:t xml:space="preserve">), </w:t>
       </w:r>
       <w:proofErr w:type="spellStart"/>
       <w:r>
@@ -81,11 +89,11 @@
       </w:tblPr>
       <w:tblGrid>
         <w:gridCol w:w="893"/>
-        <w:gridCol w:w="1821"/>
+        <w:gridCol w:w="1897"/>
         <w:gridCol w:w="1813"/>
-        <w:gridCol w:w="1577"/>
-        <w:gridCol w:w="1577"/>
-        <w:gridCol w:w="1335"/>
+        <w:gridCol w:w="2557"/>
+        <w:gridCol w:w="2557"/>
+        <w:gridCol w:w="1453"/>
       </w:tblGrid>
       <w:tr>
         <w:tc>
@@ -520,7 +528,7 @@
           <w:noProof/>
         </w:rPr>
         <w:pict w14:anchorId="2E86BC91">
-          <v:rect id="_x0000_i1030" alt="" style="width:451.3pt;height:.05pt;mso-width-percent:0;mso-height-percent:0;mso-width-percent:0;mso-height-percent:0" o:hralign="center" o:hrstd="t" o:hr="t" fillcolor="#a0a0a0" stroked="f"/>
+          <v:rect id="_x0000_i1028" alt="" style="width:451.3pt;height:.05pt;mso-width-percent:0;mso-height-percent:0;mso-width-percent:0;mso-height-percent:0" o:hralign="center" o:hrstd="t" o:hr="t" fillcolor="#a0a0a0" stroked="f"/>
         </w:pict>
       </w:r>
     </w:p>
@@ -544,6 +552,12 @@
     </w:p>
     <w:p/>
     <w:p/>
+    <w:p/>
+    <w:p/>
+    <w:p/>
+    <w:p/>
+    <w:p/>
+    <w:p/>
     <w:p>
       <w:pPr>
         <w:pStyle w:val="Heading2"/>
@@ -607,7 +621,17 @@
               <w:spacing w:after="160" w:line="259" w:lineRule="auto"/>
             </w:pPr>
             <w:r>
-              <w:t>Breakpoint Location (file:line)</w:t>
+              <w:t>Breakpoint Location (</w:t>
+            </w:r>
+            <w:proofErr w:type="spellStart"/>
+            <w:proofErr w:type="gramStart"/>
+            <w:r>
+              <w:t>file:line</w:t>
+            </w:r>
+            <w:proofErr w:type="spellEnd"/>
+            <w:proofErr w:type="gramEnd"/>
+            <w:r>
+              <w:t>)</w:t>
             </w:r>
           </w:p>
         </w:tc>
@@ -789,7 +813,7 @@
           <w:noProof/>
         </w:rPr>
         <w:pict w14:anchorId="01FCE59D">
-          <v:rect id="_x0000_i1029" alt="" style="width:451.3pt;height:.05pt;mso-width-percent:0;mso-height-percent:0;mso-width-percent:0;mso-height-percent:0" o:hralign="center" o:hrstd="t" o:hr="t" fillcolor="#a0a0a0" stroked="f"/>
+          <v:rect id="_x0000_i1027" alt="" style="width:451.3pt;height:.05pt;mso-width-percent:0;mso-height-percent:0;mso-width-percent:0;mso-height-percent:0" o:hralign="center" o:hrstd="t" o:hr="t" fillcolor="#a0a0a0" stroked="f"/>
         </w:pict>
       </w:r>
     </w:p>
@@ -840,6 +864,26 @@
           </wp:inline>
         </w:drawing>
       </w:r>
+    </w:p>
+    <w:p/>
+    <w:p>
+      <w:r>
+        <w:t xml:space="preserve">This breakpoint is testing to ensure that the enemies have been processed correctly and that the </w:t>
+      </w:r>
+      <w:proofErr w:type="spellStart"/>
+      <w:r>
+        <w:t>enemyType</w:t>
+      </w:r>
+      <w:proofErr w:type="spellEnd"/>
+      <w:r>
+        <w:t xml:space="preserve"> variable is indeed the intended/correct </w:t>
+      </w:r>
+      <w:r>
+        <w:t>value,</w:t>
+      </w:r>
+      <w:r>
+        <w:t xml:space="preserve"> which in this case was ‘zombie’ hence the test was passed successfully.</w:t>
+      </w:r>
       <w:r>
         <w:br w:type="page"/>
       </w:r>
@@ -873,11 +917,11 @@
         <w:tblLook w:val="04A0" w:firstRow="1" w:lastRow="0" w:firstColumn="1" w:lastColumn="0" w:noHBand="0" w:noVBand="1"/>
       </w:tblPr>
       <w:tblGrid>
-        <w:gridCol w:w="1832"/>
-        <w:gridCol w:w="1828"/>
-        <w:gridCol w:w="1636"/>
-        <w:gridCol w:w="2296"/>
-        <w:gridCol w:w="1424"/>
+        <w:gridCol w:w="1662"/>
+        <w:gridCol w:w="2933"/>
+        <w:gridCol w:w="3301"/>
+        <w:gridCol w:w="1974"/>
+        <w:gridCol w:w="1300"/>
       </w:tblGrid>
       <w:tr>
         <w:tc>
@@ -1018,55 +1062,70 @@
             <w:pPr>
               <w:spacing w:after="160" w:line="259" w:lineRule="auto"/>
             </w:pPr>
-          </w:p>
-        </w:tc>
-        <w:tc>
-          <w:tcPr>
-            <w:tcW w:w="0" w:type="auto"/>
-            <w:hideMark/>
-          </w:tcPr>
-          <w:p>
-            <w:pPr>
-              <w:spacing w:after="160" w:line="259" w:lineRule="auto"/>
-            </w:pPr>
-          </w:p>
-          <w:p>
-            <w:pPr>
-              <w:spacing w:after="160" w:line="259" w:lineRule="auto"/>
-            </w:pPr>
-          </w:p>
-        </w:tc>
-        <w:tc>
-          <w:tcPr>
-            <w:tcW w:w="0" w:type="auto"/>
-            <w:hideMark/>
-          </w:tcPr>
-          <w:p>
-            <w:pPr>
-              <w:spacing w:after="160" w:line="259" w:lineRule="auto"/>
-            </w:pPr>
-          </w:p>
-        </w:tc>
-        <w:tc>
-          <w:tcPr>
-            <w:tcW w:w="0" w:type="auto"/>
-            <w:hideMark/>
-          </w:tcPr>
-          <w:p>
-            <w:pPr>
-              <w:spacing w:after="160" w:line="259" w:lineRule="auto"/>
-            </w:pPr>
-          </w:p>
-        </w:tc>
-        <w:tc>
-          <w:tcPr>
-            <w:tcW w:w="0" w:type="auto"/>
-            <w:hideMark/>
-          </w:tcPr>
-          <w:p>
-            <w:pPr>
-              <w:spacing w:after="160" w:line="259" w:lineRule="auto"/>
-            </w:pPr>
+            <w:r>
+              <w:t>Duck moves to the edge of the map</w:t>
+            </w:r>
+          </w:p>
+        </w:tc>
+        <w:tc>
+          <w:tcPr>
+            <w:tcW w:w="0" w:type="auto"/>
+            <w:hideMark/>
+          </w:tcPr>
+          <w:p>
+            <w:pPr>
+              <w:spacing w:after="160" w:line="259" w:lineRule="auto"/>
+            </w:pPr>
+            <w:r>
+              <w:t>Duck stops at the wall and does not continue beyond the boundaries</w:t>
+            </w:r>
+          </w:p>
+          <w:p>
+            <w:pPr>
+              <w:spacing w:after="160" w:line="259" w:lineRule="auto"/>
+            </w:pPr>
+          </w:p>
+        </w:tc>
+        <w:tc>
+          <w:tcPr>
+            <w:tcW w:w="0" w:type="auto"/>
+            <w:hideMark/>
+          </w:tcPr>
+          <w:p>
+            <w:pPr>
+              <w:spacing w:after="160" w:line="259" w:lineRule="auto"/>
+            </w:pPr>
+            <w:r>
+              <w:t>Duck stopped at the wall</w:t>
+            </w:r>
+          </w:p>
+        </w:tc>
+        <w:tc>
+          <w:tcPr>
+            <w:tcW w:w="0" w:type="auto"/>
+            <w:hideMark/>
+          </w:tcPr>
+          <w:p>
+            <w:pPr>
+              <w:spacing w:after="160" w:line="259" w:lineRule="auto"/>
+            </w:pPr>
+            <w:r>
+              <w:t>N/A</w:t>
+            </w:r>
+          </w:p>
+        </w:tc>
+        <w:tc>
+          <w:tcPr>
+            <w:tcW w:w="0" w:type="auto"/>
+            <w:hideMark/>
+          </w:tcPr>
+          <w:p>
+            <w:pPr>
+              <w:spacing w:after="160" w:line="259" w:lineRule="auto"/>
+            </w:pPr>
+            <w:r>
+              <w:t>N/A</w:t>
+            </w:r>
           </w:p>
         </w:tc>
       </w:tr>
@@ -1080,55 +1139,78 @@
             <w:pPr>
               <w:spacing w:after="160" w:line="259" w:lineRule="auto"/>
             </w:pPr>
-          </w:p>
-        </w:tc>
-        <w:tc>
-          <w:tcPr>
-            <w:tcW w:w="0" w:type="auto"/>
-            <w:hideMark/>
-          </w:tcPr>
-          <w:p>
-            <w:pPr>
-              <w:spacing w:after="160" w:line="259" w:lineRule="auto"/>
-            </w:pPr>
-          </w:p>
-          <w:p>
-            <w:pPr>
-              <w:spacing w:after="160" w:line="259" w:lineRule="auto"/>
-            </w:pPr>
-          </w:p>
-        </w:tc>
-        <w:tc>
-          <w:tcPr>
-            <w:tcW w:w="0" w:type="auto"/>
-            <w:hideMark/>
-          </w:tcPr>
-          <w:p>
-            <w:pPr>
-              <w:spacing w:after="160" w:line="259" w:lineRule="auto"/>
-            </w:pPr>
-          </w:p>
-        </w:tc>
-        <w:tc>
-          <w:tcPr>
-            <w:tcW w:w="0" w:type="auto"/>
-            <w:hideMark/>
-          </w:tcPr>
-          <w:p>
-            <w:pPr>
-              <w:spacing w:after="160" w:line="259" w:lineRule="auto"/>
-            </w:pPr>
-          </w:p>
-        </w:tc>
-        <w:tc>
-          <w:tcPr>
-            <w:tcW w:w="0" w:type="auto"/>
-            <w:hideMark/>
-          </w:tcPr>
-          <w:p>
-            <w:pPr>
-              <w:spacing w:after="160" w:line="259" w:lineRule="auto"/>
-            </w:pPr>
+            <w:r>
+              <w:t>Duck moves onto win tile</w:t>
+            </w:r>
+          </w:p>
+        </w:tc>
+        <w:tc>
+          <w:tcPr>
+            <w:tcW w:w="0" w:type="auto"/>
+            <w:hideMark/>
+          </w:tcPr>
+          <w:p>
+            <w:pPr>
+              <w:spacing w:after="160" w:line="259" w:lineRule="auto"/>
+            </w:pPr>
+            <w:r>
+              <w:t>Duck moves smoothly, once it reaches the win tile the program stops</w:t>
+            </w:r>
+          </w:p>
+          <w:p>
+            <w:pPr>
+              <w:spacing w:after="160" w:line="259" w:lineRule="auto"/>
+            </w:pPr>
+          </w:p>
+        </w:tc>
+        <w:tc>
+          <w:tcPr>
+            <w:tcW w:w="0" w:type="auto"/>
+            <w:hideMark/>
+          </w:tcPr>
+          <w:p>
+            <w:pPr>
+              <w:spacing w:after="160" w:line="259" w:lineRule="auto"/>
+            </w:pPr>
+            <w:r>
+              <w:t xml:space="preserve">Duck smoothly moved to win </w:t>
+            </w:r>
+            <w:proofErr w:type="gramStart"/>
+            <w:r>
+              <w:t>tile</w:t>
+            </w:r>
+            <w:proofErr w:type="gramEnd"/>
+            <w:r>
+              <w:t xml:space="preserve"> and the program stopped once the tile was reached</w:t>
+            </w:r>
+          </w:p>
+        </w:tc>
+        <w:tc>
+          <w:tcPr>
+            <w:tcW w:w="0" w:type="auto"/>
+            <w:hideMark/>
+          </w:tcPr>
+          <w:p>
+            <w:pPr>
+              <w:spacing w:after="160" w:line="259" w:lineRule="auto"/>
+            </w:pPr>
+            <w:r>
+              <w:t>N/A</w:t>
+            </w:r>
+          </w:p>
+        </w:tc>
+        <w:tc>
+          <w:tcPr>
+            <w:tcW w:w="0" w:type="auto"/>
+            <w:hideMark/>
+          </w:tcPr>
+          <w:p>
+            <w:pPr>
+              <w:spacing w:after="160" w:line="259" w:lineRule="auto"/>
+            </w:pPr>
+            <w:r>
+              <w:t>N/A</w:t>
+            </w:r>
           </w:p>
         </w:tc>
       </w:tr>
@@ -1139,7 +1221,7 @@
           <w:noProof/>
         </w:rPr>
         <w:pict w14:anchorId="5E0170D4">
-          <v:rect id="_x0000_i1028" alt="" style="width:451.3pt;height:.05pt;mso-width-percent:0;mso-height-percent:0;mso-width-percent:0;mso-height-percent:0" o:hralign="center" o:hrstd="t" o:hr="t" fillcolor="#a0a0a0" stroked="f"/>
+          <v:rect id="_x0000_i1026" alt="" style="width:451.3pt;height:.05pt;mso-width-percent:0;mso-height-percent:0;mso-width-percent:0;mso-height-percent:0" o:hralign="center" o:hrstd="t" o:hr="t" fillcolor="#a0a0a0" stroked="f"/>
         </w:pict>
       </w:r>
     </w:p>
@@ -1392,8 +1474,13 @@
         </w:rPr>
         <w:t xml:space="preserve"> </w:t>
       </w:r>
-      <w:r>
-        <w:t>( ) = variable/line value when tested</w:t>
+      <w:proofErr w:type="gramStart"/>
+      <w:r>
+        <w:t>( )</w:t>
+      </w:r>
+      <w:proofErr w:type="gramEnd"/>
+      <w:r>
+        <w:t xml:space="preserve"> = variable/line value when tested</w:t>
       </w:r>
     </w:p>
     <w:p>
@@ -1502,6 +1589,460 @@
       </w:r>
       <w:r>
         <w:t xml:space="preserve"> and the method should work as intended.</w:t>
+      </w:r>
+    </w:p>
+    <w:p/>
+    <w:p>
+      <w:pPr>
+        <w:pStyle w:val="Heading2"/>
+        <w:rPr>
+          <w:b/>
+          <w:bCs/>
+        </w:rPr>
+      </w:pPr>
+      <w:r>
+        <w:rPr>
+          <w:b/>
+          <w:bCs/>
+        </w:rPr>
+        <w:lastRenderedPageBreak/>
+        <w:t>Section 5: Bug Log &amp; Resolution</w:t>
+      </w:r>
+    </w:p>
+    <w:p>
+      <w:r>
+        <w:t>Keep track of every bug you fix in your prototype.</w:t>
+      </w:r>
+    </w:p>
+    <w:tbl>
+      <w:tblPr>
+        <w:tblStyle w:val="TableGrid"/>
+        <w:tblW w:w="0" w:type="auto"/>
+        <w:tblLook w:val="04A0" w:firstRow="1" w:lastRow="0" w:firstColumn="1" w:lastColumn="0" w:noHBand="0" w:noVBand="1"/>
+      </w:tblPr>
+      <w:tblGrid>
+        <w:gridCol w:w="705"/>
+        <w:gridCol w:w="1705"/>
+        <w:gridCol w:w="2435"/>
+        <w:gridCol w:w="3084"/>
+        <w:gridCol w:w="2305"/>
+        <w:gridCol w:w="936"/>
+      </w:tblGrid>
+      <w:tr>
+        <w:tc>
+          <w:tcPr>
+            <w:tcW w:w="0" w:type="auto"/>
+            <w:hideMark/>
+          </w:tcPr>
+          <w:p>
+            <w:pPr>
+              <w:spacing w:after="160" w:line="259" w:lineRule="auto"/>
+            </w:pPr>
+            <w:r>
+              <w:t>Bug ID</w:t>
+            </w:r>
+          </w:p>
+        </w:tc>
+        <w:tc>
+          <w:tcPr>
+            <w:tcW w:w="1705" w:type="dxa"/>
+            <w:hideMark/>
+          </w:tcPr>
+          <w:p>
+            <w:pPr>
+              <w:spacing w:after="160" w:line="259" w:lineRule="auto"/>
+              <w:jc w:val="center"/>
+            </w:pPr>
+            <w:r>
+              <w:t>Description</w:t>
+            </w:r>
+          </w:p>
+        </w:tc>
+        <w:tc>
+          <w:tcPr>
+            <w:tcW w:w="2435" w:type="dxa"/>
+            <w:hideMark/>
+          </w:tcPr>
+          <w:p>
+            <w:pPr>
+              <w:spacing w:after="160" w:line="259" w:lineRule="auto"/>
+              <w:jc w:val="center"/>
+            </w:pPr>
+            <w:r>
+              <w:t>Type (Syntax/Logic/Runtime)</w:t>
+            </w:r>
+          </w:p>
+        </w:tc>
+        <w:tc>
+          <w:tcPr>
+            <w:tcW w:w="0" w:type="auto"/>
+            <w:hideMark/>
+          </w:tcPr>
+          <w:p>
+            <w:pPr>
+              <w:spacing w:after="160" w:line="259" w:lineRule="auto"/>
+              <w:jc w:val="center"/>
+            </w:pPr>
+            <w:r>
+              <w:t>Debug Technique Used</w:t>
+            </w:r>
+          </w:p>
+        </w:tc>
+        <w:tc>
+          <w:tcPr>
+            <w:tcW w:w="2305" w:type="dxa"/>
+            <w:hideMark/>
+          </w:tcPr>
+          <w:p>
+            <w:pPr>
+              <w:spacing w:after="160" w:line="259" w:lineRule="auto"/>
+              <w:jc w:val="center"/>
+            </w:pPr>
+            <w:r>
+              <w:t>Fix Implemented</w:t>
+            </w:r>
+          </w:p>
+        </w:tc>
+        <w:tc>
+          <w:tcPr>
+            <w:tcW w:w="799" w:type="dxa"/>
+            <w:hideMark/>
+          </w:tcPr>
+          <w:p>
+            <w:pPr>
+              <w:spacing w:after="160" w:line="259" w:lineRule="auto"/>
+              <w:jc w:val="center"/>
+            </w:pPr>
+            <w:r>
+              <w:t>Verified (Y/N)</w:t>
+            </w:r>
+          </w:p>
+        </w:tc>
+      </w:tr>
+      <w:tr>
+        <w:tc>
+          <w:tcPr>
+            <w:tcW w:w="0" w:type="auto"/>
+            <w:hideMark/>
+          </w:tcPr>
+          <w:p>
+            <w:pPr>
+              <w:spacing w:after="160" w:line="259" w:lineRule="auto"/>
+            </w:pPr>
+            <w:r>
+              <w:t>1</w:t>
+            </w:r>
+          </w:p>
+        </w:tc>
+        <w:tc>
+          <w:tcPr>
+            <w:tcW w:w="1705" w:type="dxa"/>
+            <w:hideMark/>
+          </w:tcPr>
+          <w:p>
+            <w:pPr>
+              <w:spacing w:after="160" w:line="259" w:lineRule="auto"/>
+            </w:pPr>
+            <w:r>
+              <w:t>Issue with the path to assets</w:t>
+            </w:r>
+          </w:p>
+          <w:p>
+            <w:pPr>
+              <w:spacing w:after="160" w:line="259" w:lineRule="auto"/>
+            </w:pPr>
+          </w:p>
+        </w:tc>
+        <w:tc>
+          <w:tcPr>
+            <w:tcW w:w="2435" w:type="dxa"/>
+            <w:hideMark/>
+          </w:tcPr>
+          <w:p>
+            <w:pPr>
+              <w:spacing w:after="160" w:line="259" w:lineRule="auto"/>
+            </w:pPr>
+            <w:r>
+              <w:t>Runtime Error</w:t>
+            </w:r>
+          </w:p>
+        </w:tc>
+        <w:tc>
+          <w:tcPr>
+            <w:tcW w:w="0" w:type="auto"/>
+            <w:hideMark/>
+          </w:tcPr>
+          <w:p>
+            <w:pPr>
+              <w:spacing w:after="160" w:line="259" w:lineRule="auto"/>
+            </w:pPr>
+            <w:r>
+              <w:t>Desk Checking</w:t>
+            </w:r>
+            <w:r>
+              <w:t xml:space="preserve"> (original table used has been lost)</w:t>
+            </w:r>
+          </w:p>
+        </w:tc>
+        <w:tc>
+          <w:tcPr>
+            <w:tcW w:w="2305" w:type="dxa"/>
+            <w:hideMark/>
+          </w:tcPr>
+          <w:p>
+            <w:pPr>
+              <w:spacing w:after="160" w:line="259" w:lineRule="auto"/>
+            </w:pPr>
+            <w:r>
+              <w:t xml:space="preserve">Changed the path to no longer start from the ‘Year 12’ parent file but as the working directory being the main TowerDefence file </w:t>
+            </w:r>
+          </w:p>
+        </w:tc>
+        <w:tc>
+          <w:tcPr>
+            <w:tcW w:w="799" w:type="dxa"/>
+            <w:hideMark/>
+          </w:tcPr>
+          <w:p>
+            <w:pPr>
+              <w:spacing w:after="160" w:line="259" w:lineRule="auto"/>
+              <w:jc w:val="center"/>
+            </w:pPr>
+            <w:r>
+              <w:t>Y</w:t>
+            </w:r>
+          </w:p>
+        </w:tc>
+      </w:tr>
+      <w:tr>
+        <w:tc>
+          <w:tcPr>
+            <w:tcW w:w="0" w:type="auto"/>
+            <w:hideMark/>
+          </w:tcPr>
+          <w:p>
+            <w:pPr>
+              <w:spacing w:after="160" w:line="259" w:lineRule="auto"/>
+            </w:pPr>
+            <w:r>
+              <w:t>2</w:t>
+            </w:r>
+          </w:p>
+        </w:tc>
+        <w:tc>
+          <w:tcPr>
+            <w:tcW w:w="1705" w:type="dxa"/>
+            <w:hideMark/>
+          </w:tcPr>
+          <w:p>
+            <w:pPr>
+              <w:spacing w:after="160" w:line="259" w:lineRule="auto"/>
+            </w:pPr>
+            <w:r>
+              <w:t>Font not initialised Error</w:t>
+            </w:r>
+          </w:p>
+          <w:p>
+            <w:pPr>
+              <w:spacing w:after="160" w:line="259" w:lineRule="auto"/>
+            </w:pPr>
+          </w:p>
+        </w:tc>
+        <w:tc>
+          <w:tcPr>
+            <w:tcW w:w="2435" w:type="dxa"/>
+            <w:hideMark/>
+          </w:tcPr>
+          <w:p>
+            <w:pPr>
+              <w:spacing w:after="160" w:line="259" w:lineRule="auto"/>
+            </w:pPr>
+            <w:r>
+              <w:t>Runtime Error</w:t>
+            </w:r>
+          </w:p>
+        </w:tc>
+        <w:tc>
+          <w:tcPr>
+            <w:tcW w:w="0" w:type="auto"/>
+            <w:hideMark/>
+          </w:tcPr>
+          <w:p>
+            <w:pPr>
+              <w:spacing w:after="160" w:line="259" w:lineRule="auto"/>
+            </w:pPr>
+            <w:r>
+              <w:t>Compiler</w:t>
+            </w:r>
+          </w:p>
+        </w:tc>
+        <w:tc>
+          <w:tcPr>
+            <w:tcW w:w="2305" w:type="dxa"/>
+            <w:hideMark/>
+          </w:tcPr>
+          <w:p>
+            <w:pPr>
+              <w:spacing w:after="160" w:line="259" w:lineRule="auto"/>
+            </w:pPr>
+            <w:r>
+              <w:t xml:space="preserve">Moved the </w:t>
+            </w:r>
+            <w:proofErr w:type="spellStart"/>
+            <w:proofErr w:type="gramStart"/>
+            <w:r>
+              <w:t>pygame.init</w:t>
+            </w:r>
+            <w:proofErr w:type="spellEnd"/>
+            <w:proofErr w:type="gramEnd"/>
+            <w:r>
+              <w:t xml:space="preserve">() and </w:t>
+            </w:r>
+            <w:proofErr w:type="spellStart"/>
+            <w:r>
+              <w:t>pygame.mixer.init</w:t>
+            </w:r>
+            <w:proofErr w:type="spellEnd"/>
+            <w:r>
+              <w:t xml:space="preserve">() functions to before importing the </w:t>
+            </w:r>
+            <w:proofErr w:type="spellStart"/>
+            <w:r>
+              <w:t>GameStateManager</w:t>
+            </w:r>
+            <w:proofErr w:type="spellEnd"/>
+            <w:r>
+              <w:t xml:space="preserve"> class</w:t>
+            </w:r>
+          </w:p>
+        </w:tc>
+        <w:tc>
+          <w:tcPr>
+            <w:tcW w:w="799" w:type="dxa"/>
+            <w:hideMark/>
+          </w:tcPr>
+          <w:p>
+            <w:pPr>
+              <w:spacing w:after="160" w:line="259" w:lineRule="auto"/>
+              <w:jc w:val="center"/>
+            </w:pPr>
+            <w:r>
+              <w:t>Y</w:t>
+            </w:r>
+          </w:p>
+          <w:p>
+            <w:pPr>
+              <w:spacing w:after="160" w:line="259" w:lineRule="auto"/>
+            </w:pPr>
+          </w:p>
+        </w:tc>
+      </w:tr>
+      <w:tr>
+        <w:tc>
+          <w:tcPr>
+            <w:tcW w:w="0" w:type="auto"/>
+            <w:hideMark/>
+          </w:tcPr>
+          <w:p>
+            <w:pPr>
+              <w:spacing w:after="160" w:line="259" w:lineRule="auto"/>
+            </w:pPr>
+            <w:r>
+              <w:t>3</w:t>
+            </w:r>
+          </w:p>
+        </w:tc>
+        <w:tc>
+          <w:tcPr>
+            <w:tcW w:w="1705" w:type="dxa"/>
+            <w:hideMark/>
+          </w:tcPr>
+          <w:p>
+            <w:pPr>
+              <w:spacing w:after="160" w:line="259" w:lineRule="auto"/>
+            </w:pPr>
+            <w:r>
+              <w:t>Enemy Sprite Rotating incorrectly</w:t>
+            </w:r>
+          </w:p>
+          <w:p>
+            <w:pPr>
+              <w:spacing w:after="160" w:line="259" w:lineRule="auto"/>
+            </w:pPr>
+          </w:p>
+        </w:tc>
+        <w:tc>
+          <w:tcPr>
+            <w:tcW w:w="2435" w:type="dxa"/>
+            <w:hideMark/>
+          </w:tcPr>
+          <w:p>
+            <w:pPr>
+              <w:spacing w:after="160" w:line="259" w:lineRule="auto"/>
+            </w:pPr>
+            <w:r>
+              <w:t>Logic error</w:t>
+            </w:r>
+          </w:p>
+        </w:tc>
+        <w:tc>
+          <w:tcPr>
+            <w:tcW w:w="0" w:type="auto"/>
+            <w:hideMark/>
+          </w:tcPr>
+          <w:p>
+            <w:pPr>
+              <w:spacing w:after="160" w:line="259" w:lineRule="auto"/>
+            </w:pPr>
+            <w:r>
+              <w:t>Print Statements</w:t>
+            </w:r>
+          </w:p>
+        </w:tc>
+        <w:tc>
+          <w:tcPr>
+            <w:tcW w:w="2305" w:type="dxa"/>
+            <w:hideMark/>
+          </w:tcPr>
+          <w:p>
+            <w:pPr>
+              <w:spacing w:after="160" w:line="259" w:lineRule="auto"/>
+            </w:pPr>
+            <w:r>
+              <w:t>Changed the logic so that instead of rotating the enemy’s sprite is flipped in the X if the angle between the next waypoint and the enemy is &gt; ±175˚which gives the enemies a much smoother/natural motion</w:t>
+            </w:r>
+          </w:p>
+          <w:p>
+            <w:pPr>
+              <w:spacing w:after="160" w:line="259" w:lineRule="auto"/>
+            </w:pPr>
+          </w:p>
+        </w:tc>
+        <w:tc>
+          <w:tcPr>
+            <w:tcW w:w="799" w:type="dxa"/>
+            <w:hideMark/>
+          </w:tcPr>
+          <w:p>
+            <w:pPr>
+              <w:spacing w:after="160" w:line="259" w:lineRule="auto"/>
+              <w:jc w:val="center"/>
+            </w:pPr>
+            <w:r>
+              <w:t>Y</w:t>
+            </w:r>
+          </w:p>
+        </w:tc>
+      </w:tr>
+    </w:tbl>
+    <w:p>
+      <w:r>
+        <w:rPr>
+          <w:noProof/>
+        </w:rPr>
+        <w:pict w14:anchorId="3CD1D7EE">
+          <v:rect id="_x0000_i1025" alt="" style="width:451.3pt;height:.05pt;mso-width-percent:0;mso-height-percent:0;mso-width-percent:0;mso-height-percent:0" o:hralign="center" o:hrstd="t" o:hr="t" fillcolor="#a0a0a0" stroked="f"/>
+        </w:pict>
       </w:r>
     </w:p>
     <w:p>
@@ -1517,483 +2058,47 @@
           <w:b/>
           <w:bCs/>
         </w:rPr>
-        <w:lastRenderedPageBreak/>
-        <w:t>Section 5: Bug Log &amp; Resolution</w:t>
-      </w:r>
-    </w:p>
-    <w:p>
-      <w:r>
-        <w:t>Keep track of every bug you fix in your prototype.</w:t>
-      </w:r>
-    </w:p>
-    <w:tbl>
-      <w:tblPr>
-        <w:tblStyle w:val="TableGrid"/>
-        <w:tblW w:w="0" w:type="auto"/>
-        <w:tblLook w:val="04A0" w:firstRow="1" w:lastRow="0" w:firstColumn="1" w:lastColumn="0" w:noHBand="0" w:noVBand="1"/>
-      </w:tblPr>
-      <w:tblGrid>
-        <w:gridCol w:w="579"/>
-        <w:gridCol w:w="1533"/>
-        <w:gridCol w:w="2435"/>
-        <w:gridCol w:w="1314"/>
-        <w:gridCol w:w="2219"/>
-        <w:gridCol w:w="936"/>
-      </w:tblGrid>
-      <w:tr>
-        <w:tc>
-          <w:tcPr>
-            <w:tcW w:w="0" w:type="auto"/>
-            <w:hideMark/>
-          </w:tcPr>
-          <w:p>
-            <w:pPr>
-              <w:spacing w:after="160" w:line="259" w:lineRule="auto"/>
-            </w:pPr>
-            <w:r>
-              <w:t>Bug ID</w:t>
-            </w:r>
-          </w:p>
-        </w:tc>
-        <w:tc>
-          <w:tcPr>
-            <w:tcW w:w="1705" w:type="dxa"/>
-            <w:hideMark/>
-          </w:tcPr>
-          <w:p>
-            <w:pPr>
-              <w:spacing w:after="160" w:line="259" w:lineRule="auto"/>
-              <w:jc w:val="center"/>
-            </w:pPr>
-            <w:r>
-              <w:t>Description</w:t>
-            </w:r>
-          </w:p>
-        </w:tc>
-        <w:tc>
-          <w:tcPr>
-            <w:tcW w:w="2435" w:type="dxa"/>
-            <w:hideMark/>
-          </w:tcPr>
-          <w:p>
-            <w:pPr>
-              <w:spacing w:after="160" w:line="259" w:lineRule="auto"/>
-              <w:jc w:val="center"/>
-            </w:pPr>
-            <w:r>
-              <w:t>Type (Syntax/Logic/Runtime)</w:t>
-            </w:r>
-          </w:p>
-        </w:tc>
-        <w:tc>
-          <w:tcPr>
-            <w:tcW w:w="0" w:type="auto"/>
-            <w:hideMark/>
-          </w:tcPr>
-          <w:p>
-            <w:pPr>
-              <w:spacing w:after="160" w:line="259" w:lineRule="auto"/>
-              <w:jc w:val="center"/>
-            </w:pPr>
-            <w:r>
-              <w:t>Debug Technique Used</w:t>
-            </w:r>
-          </w:p>
-        </w:tc>
-        <w:tc>
-          <w:tcPr>
-            <w:tcW w:w="2305" w:type="dxa"/>
-            <w:hideMark/>
-          </w:tcPr>
-          <w:p>
-            <w:pPr>
-              <w:spacing w:after="160" w:line="259" w:lineRule="auto"/>
-              <w:jc w:val="center"/>
-            </w:pPr>
-            <w:r>
-              <w:t>Fix Implemented</w:t>
-            </w:r>
-          </w:p>
-        </w:tc>
-        <w:tc>
-          <w:tcPr>
-            <w:tcW w:w="799" w:type="dxa"/>
-            <w:hideMark/>
-          </w:tcPr>
-          <w:p>
-            <w:pPr>
-              <w:spacing w:after="160" w:line="259" w:lineRule="auto"/>
-              <w:jc w:val="center"/>
-            </w:pPr>
-            <w:r>
-              <w:t>Verified (Y/N)</w:t>
-            </w:r>
-          </w:p>
-        </w:tc>
-      </w:tr>
-      <w:tr>
-        <w:tc>
-          <w:tcPr>
-            <w:tcW w:w="0" w:type="auto"/>
-            <w:hideMark/>
-          </w:tcPr>
-          <w:p>
-            <w:pPr>
-              <w:spacing w:after="160" w:line="259" w:lineRule="auto"/>
-            </w:pPr>
-            <w:r>
-              <w:t>1</w:t>
-            </w:r>
-          </w:p>
-        </w:tc>
-        <w:tc>
-          <w:tcPr>
-            <w:tcW w:w="1705" w:type="dxa"/>
-            <w:hideMark/>
-          </w:tcPr>
-          <w:p>
-            <w:pPr>
-              <w:spacing w:after="160" w:line="259" w:lineRule="auto"/>
-            </w:pPr>
-            <w:r>
-              <w:t>Issue with the path to assets</w:t>
-            </w:r>
-          </w:p>
-          <w:p>
-            <w:pPr>
-              <w:spacing w:after="160" w:line="259" w:lineRule="auto"/>
-            </w:pPr>
-          </w:p>
-        </w:tc>
-        <w:tc>
-          <w:tcPr>
-            <w:tcW w:w="2435" w:type="dxa"/>
-            <w:hideMark/>
-          </w:tcPr>
-          <w:p>
-            <w:pPr>
-              <w:spacing w:after="160" w:line="259" w:lineRule="auto"/>
-            </w:pPr>
-            <w:r>
-              <w:t>Runtime Error</w:t>
-            </w:r>
-          </w:p>
-        </w:tc>
-        <w:tc>
-          <w:tcPr>
-            <w:tcW w:w="0" w:type="auto"/>
-            <w:hideMark/>
-          </w:tcPr>
-          <w:p>
-            <w:pPr>
-              <w:spacing w:after="160" w:line="259" w:lineRule="auto"/>
-            </w:pPr>
-            <w:r>
-              <w:t>Desk Checking</w:t>
-            </w:r>
-            <w:r>
-              <w:t xml:space="preserve"> (original table used has been lost)</w:t>
-            </w:r>
-          </w:p>
-        </w:tc>
-        <w:tc>
-          <w:tcPr>
-            <w:tcW w:w="2305" w:type="dxa"/>
-            <w:hideMark/>
-          </w:tcPr>
-          <w:p>
-            <w:pPr>
-              <w:spacing w:after="160" w:line="259" w:lineRule="auto"/>
-            </w:pPr>
-            <w:r>
-              <w:t xml:space="preserve">Changed the path to no longer start from the ‘Year 12’ parent file but as the working directory being the main TowerDefence file </w:t>
-            </w:r>
-          </w:p>
-        </w:tc>
-        <w:tc>
-          <w:tcPr>
-            <w:tcW w:w="799" w:type="dxa"/>
-            <w:hideMark/>
-          </w:tcPr>
-          <w:p>
-            <w:pPr>
-              <w:spacing w:after="160" w:line="259" w:lineRule="auto"/>
-              <w:jc w:val="center"/>
-            </w:pPr>
-            <w:r>
-              <w:t>Y</w:t>
-            </w:r>
-          </w:p>
-        </w:tc>
-      </w:tr>
-      <w:tr>
-        <w:tc>
-          <w:tcPr>
-            <w:tcW w:w="0" w:type="auto"/>
-            <w:hideMark/>
-          </w:tcPr>
-          <w:p>
-            <w:pPr>
-              <w:spacing w:after="160" w:line="259" w:lineRule="auto"/>
-            </w:pPr>
-            <w:r>
-              <w:t>2</w:t>
-            </w:r>
-          </w:p>
-        </w:tc>
-        <w:tc>
-          <w:tcPr>
-            <w:tcW w:w="1705" w:type="dxa"/>
-            <w:hideMark/>
-          </w:tcPr>
-          <w:p>
-            <w:pPr>
-              <w:spacing w:after="160" w:line="259" w:lineRule="auto"/>
-            </w:pPr>
-            <w:r>
-              <w:t>Font not initialised Error</w:t>
-            </w:r>
-          </w:p>
-          <w:p>
-            <w:pPr>
-              <w:spacing w:after="160" w:line="259" w:lineRule="auto"/>
-            </w:pPr>
-          </w:p>
-        </w:tc>
-        <w:tc>
-          <w:tcPr>
-            <w:tcW w:w="2435" w:type="dxa"/>
-            <w:hideMark/>
-          </w:tcPr>
-          <w:p>
-            <w:pPr>
-              <w:spacing w:after="160" w:line="259" w:lineRule="auto"/>
-            </w:pPr>
-            <w:r>
-              <w:t>Runtime Error</w:t>
-            </w:r>
-          </w:p>
-        </w:tc>
-        <w:tc>
-          <w:tcPr>
-            <w:tcW w:w="0" w:type="auto"/>
-            <w:hideMark/>
-          </w:tcPr>
-          <w:p>
-            <w:pPr>
-              <w:spacing w:after="160" w:line="259" w:lineRule="auto"/>
-            </w:pPr>
-            <w:r>
-              <w:t>Compiler</w:t>
-            </w:r>
-          </w:p>
-        </w:tc>
-        <w:tc>
-          <w:tcPr>
-            <w:tcW w:w="2305" w:type="dxa"/>
-            <w:hideMark/>
-          </w:tcPr>
-          <w:p>
-            <w:pPr>
-              <w:spacing w:after="160" w:line="259" w:lineRule="auto"/>
-            </w:pPr>
-            <w:r>
-              <w:t xml:space="preserve">Moved the </w:t>
-            </w:r>
-            <w:proofErr w:type="spellStart"/>
-            <w:proofErr w:type="gramStart"/>
-            <w:r>
-              <w:t>pygame.init</w:t>
-            </w:r>
-            <w:proofErr w:type="spellEnd"/>
-            <w:proofErr w:type="gramEnd"/>
-            <w:r>
-              <w:t xml:space="preserve">() and </w:t>
-            </w:r>
-            <w:proofErr w:type="spellStart"/>
-            <w:r>
-              <w:t>pygame.mixer.init</w:t>
-            </w:r>
-            <w:proofErr w:type="spellEnd"/>
-            <w:r>
-              <w:t xml:space="preserve">() functions to before importing the </w:t>
-            </w:r>
-            <w:proofErr w:type="spellStart"/>
-            <w:r>
-              <w:t>GameStateManager</w:t>
-            </w:r>
-            <w:proofErr w:type="spellEnd"/>
-            <w:r>
-              <w:t xml:space="preserve"> class</w:t>
-            </w:r>
-          </w:p>
-        </w:tc>
-        <w:tc>
-          <w:tcPr>
-            <w:tcW w:w="799" w:type="dxa"/>
-            <w:hideMark/>
-          </w:tcPr>
-          <w:p>
-            <w:pPr>
-              <w:spacing w:after="160" w:line="259" w:lineRule="auto"/>
-              <w:jc w:val="center"/>
-            </w:pPr>
-            <w:r>
-              <w:t>Y</w:t>
-            </w:r>
-          </w:p>
-          <w:p>
-            <w:pPr>
-              <w:spacing w:after="160" w:line="259" w:lineRule="auto"/>
-            </w:pPr>
-          </w:p>
-        </w:tc>
-      </w:tr>
-      <w:tr>
-        <w:tc>
-          <w:tcPr>
-            <w:tcW w:w="0" w:type="auto"/>
-            <w:hideMark/>
-          </w:tcPr>
-          <w:p>
-            <w:pPr>
-              <w:spacing w:after="160" w:line="259" w:lineRule="auto"/>
-            </w:pPr>
-            <w:r>
-              <w:t>3</w:t>
-            </w:r>
-          </w:p>
-        </w:tc>
-        <w:tc>
-          <w:tcPr>
-            <w:tcW w:w="1705" w:type="dxa"/>
-            <w:hideMark/>
-          </w:tcPr>
-          <w:p>
-            <w:pPr>
-              <w:spacing w:after="160" w:line="259" w:lineRule="auto"/>
-            </w:pPr>
-            <w:r>
-              <w:t>Enemy Sprite Rotating incorrectly</w:t>
-            </w:r>
-          </w:p>
-          <w:p>
-            <w:pPr>
-              <w:spacing w:after="160" w:line="259" w:lineRule="auto"/>
-            </w:pPr>
-          </w:p>
-        </w:tc>
-        <w:tc>
-          <w:tcPr>
-            <w:tcW w:w="2435" w:type="dxa"/>
-            <w:hideMark/>
-          </w:tcPr>
-          <w:p>
-            <w:pPr>
-              <w:spacing w:after="160" w:line="259" w:lineRule="auto"/>
-            </w:pPr>
-            <w:r>
-              <w:t>Logic error</w:t>
-            </w:r>
-          </w:p>
-        </w:tc>
-        <w:tc>
-          <w:tcPr>
-            <w:tcW w:w="0" w:type="auto"/>
-            <w:hideMark/>
-          </w:tcPr>
-          <w:p>
-            <w:pPr>
-              <w:spacing w:after="160" w:line="259" w:lineRule="auto"/>
-            </w:pPr>
-            <w:r>
-              <w:t>Print Statements</w:t>
-            </w:r>
-          </w:p>
-        </w:tc>
-        <w:tc>
-          <w:tcPr>
-            <w:tcW w:w="2305" w:type="dxa"/>
-            <w:hideMark/>
-          </w:tcPr>
-          <w:p>
-            <w:pPr>
-              <w:spacing w:after="160" w:line="259" w:lineRule="auto"/>
-            </w:pPr>
-            <w:r>
-              <w:t>Changed the logic so that instead of rotating the enemy’s sprite is flipped in the X if the angle between the next waypoint and the enemy is &gt; ±175˚which gives the enemies a much smoother/natural motion</w:t>
-            </w:r>
-          </w:p>
-          <w:p>
-            <w:pPr>
-              <w:spacing w:after="160" w:line="259" w:lineRule="auto"/>
-            </w:pPr>
-          </w:p>
-        </w:tc>
-        <w:tc>
-          <w:tcPr>
-            <w:tcW w:w="799" w:type="dxa"/>
-            <w:hideMark/>
-          </w:tcPr>
-          <w:p>
-            <w:pPr>
-              <w:spacing w:after="160" w:line="259" w:lineRule="auto"/>
-              <w:jc w:val="center"/>
-            </w:pPr>
-            <w:r>
-              <w:t>Y</w:t>
-            </w:r>
-          </w:p>
-        </w:tc>
-      </w:tr>
-    </w:tbl>
-    <w:p>
-      <w:r>
-        <w:rPr>
-          <w:noProof/>
-        </w:rPr>
-        <w:pict w14:anchorId="3CD1D7EE">
-          <v:rect id="_x0000_i1027" alt="" style="width:451.3pt;height:.05pt;mso-width-percent:0;mso-height-percent:0;mso-width-percent:0;mso-height-percent:0" o:hralign="center" o:hrstd="t" o:hr="t" fillcolor="#a0a0a0" stroked="f"/>
-        </w:pict>
-      </w:r>
-    </w:p>
-    <w:p>
-      <w:pPr>
-        <w:pStyle w:val="Heading2"/>
+        <w:t xml:space="preserve">Note – more visible in my </w:t>
+      </w:r>
+      <w:proofErr w:type="spellStart"/>
+      <w:r>
         <w:rPr>
           <w:b/>
           <w:bCs/>
         </w:rPr>
-      </w:pPr>
-    </w:p>
-    <w:p/>
-    <w:p/>
-    <w:p/>
-    <w:p/>
-    <w:p/>
-    <w:p/>
-    <w:p>
-      <w:pPr>
-        <w:pStyle w:val="Heading2"/>
+        <w:t>github</w:t>
+      </w:r>
+      <w:proofErr w:type="spellEnd"/>
+      <w:r>
         <w:rPr>
           <w:b/>
           <w:bCs/>
         </w:rPr>
-      </w:pPr>
+        <w:t xml:space="preserve"> commits</w:t>
+      </w:r>
       <w:r>
         <w:rPr>
           <w:b/>
           <w:bCs/>
         </w:rPr>
-        <w:lastRenderedPageBreak/>
-        <w:t xml:space="preserve">Section </w:t>
-      </w:r>
+        <w:t xml:space="preserve"> available at: </w:t>
+      </w:r>
+      <w:hyperlink r:id="rId11" w:history="1">
+        <w:r>
+          <w:rPr>
+            <w:rStyle w:val="Hyperlink"/>
+            <w:b/>
+            <w:bCs/>
+          </w:rPr>
+          <w:t>https://github.com/General-Hex/tower-defence/tree/Backtracked</w:t>
+        </w:r>
+      </w:hyperlink>
       <w:r>
         <w:rPr>
           <w:b/>
           <w:bCs/>
         </w:rPr>
-        <w:t>6: Unit Testing</w:t>
+        <w:t xml:space="preserve"> </w:t>
       </w:r>
     </w:p>
     <w:p/>
@@ -2008,6 +2113,151 @@
           <w:bCs/>
         </w:rPr>
       </w:pPr>
+      <w:r>
+        <w:rPr>
+          <w:noProof/>
+        </w:rPr>
+        <w:lastRenderedPageBreak/>
+        <mc:AlternateContent>
+          <mc:Choice Requires="wpg">
+            <w:drawing>
+              <wp:anchor distT="0" distB="0" distL="114300" distR="114300" simplePos="0" relativeHeight="251657216" behindDoc="0" locked="0" layoutInCell="1" allowOverlap="1" wp14:anchorId="5EC64B01" wp14:editId="5E6E8154">
+                <wp:simplePos x="0" y="0"/>
+                <wp:positionH relativeFrom="column">
+                  <wp:posOffset>-27248</wp:posOffset>
+                </wp:positionH>
+                <wp:positionV relativeFrom="page">
+                  <wp:posOffset>1242100</wp:posOffset>
+                </wp:positionV>
+                <wp:extent cx="2961640" cy="3023235"/>
+                <wp:effectExtent l="0" t="0" r="0" b="0"/>
+                <wp:wrapSquare wrapText="bothSides"/>
+                <wp:docPr id="1334784240" name="Group 8"/>
+                <wp:cNvGraphicFramePr/>
+                <a:graphic xmlns:a="http://schemas.openxmlformats.org/drawingml/2006/main">
+                  <a:graphicData uri="http://schemas.microsoft.com/office/word/2010/wordprocessingGroup">
+                    <wpg:wgp>
+                      <wpg:cNvGrpSpPr/>
+                      <wpg:grpSpPr>
+                        <a:xfrm>
+                          <a:off x="0" y="0"/>
+                          <a:ext cx="2961640" cy="3023235"/>
+                          <a:chOff x="0" y="0"/>
+                          <a:chExt cx="2961640" cy="3023415"/>
+                        </a:xfrm>
+                      </wpg:grpSpPr>
+                      <pic:pic xmlns:pic="http://schemas.openxmlformats.org/drawingml/2006/picture">
+                        <pic:nvPicPr>
+                          <pic:cNvPr id="218830980" name="Picture 2" descr="A screen shot of a computer program&#10;&#10;AI-generated content may be incorrect."/>
+                          <pic:cNvPicPr>
+                            <a:picLocks noChangeAspect="1"/>
+                          </pic:cNvPicPr>
+                        </pic:nvPicPr>
+                        <pic:blipFill>
+                          <a:blip r:embed="rId12" cstate="print">
+                            <a:extLst>
+                              <a:ext uri="{28A0092B-C50C-407E-A947-70E740481C1C}">
+                                <a14:useLocalDpi xmlns:a14="http://schemas.microsoft.com/office/drawing/2010/main" val="0"/>
+                              </a:ext>
+                            </a:extLst>
+                          </a:blip>
+                          <a:stretch>
+                            <a:fillRect/>
+                          </a:stretch>
+                        </pic:blipFill>
+                        <pic:spPr>
+                          <a:xfrm>
+                            <a:off x="0" y="0"/>
+                            <a:ext cx="2961640" cy="2229485"/>
+                          </a:xfrm>
+                          <a:prstGeom prst="rect">
+                            <a:avLst/>
+                          </a:prstGeom>
+                        </pic:spPr>
+                      </pic:pic>
+                      <pic:pic xmlns:pic="http://schemas.openxmlformats.org/drawingml/2006/picture">
+                        <pic:nvPicPr>
+                          <pic:cNvPr id="2127592774" name="Picture 1" descr="A screen shot of a computer code&#10;&#10;AI-generated content may be incorrect."/>
+                          <pic:cNvPicPr>
+                            <a:picLocks noChangeAspect="1"/>
+                          </pic:cNvPicPr>
+                        </pic:nvPicPr>
+                        <pic:blipFill>
+                          <a:blip r:embed="rId13" cstate="print">
+                            <a:extLst>
+                              <a:ext uri="{28A0092B-C50C-407E-A947-70E740481C1C}">
+                                <a14:useLocalDpi xmlns:a14="http://schemas.microsoft.com/office/drawing/2010/main" val="0"/>
+                              </a:ext>
+                            </a:extLst>
+                          </a:blip>
+                          <a:stretch>
+                            <a:fillRect/>
+                          </a:stretch>
+                        </pic:blipFill>
+                        <pic:spPr>
+                          <a:xfrm>
+                            <a:off x="0" y="2224585"/>
+                            <a:ext cx="2961640" cy="798830"/>
+                          </a:xfrm>
+                          <a:prstGeom prst="rect">
+                            <a:avLst/>
+                          </a:prstGeom>
+                        </pic:spPr>
+                      </pic:pic>
+                    </wpg:wgp>
+                  </a:graphicData>
+                </a:graphic>
+              </wp:anchor>
+            </w:drawing>
+          </mc:Choice>
+          <mc:Fallback>
+            <w:pict>
+              <v:group w14:anchorId="73929712" id="Group 8" o:spid="_x0000_s1026" style="position:absolute;margin-left:-2.15pt;margin-top:97.8pt;width:233.2pt;height:238.05pt;z-index:251657216;mso-position-vertical-relative:page" coordsize="29616,30234" o:gfxdata="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">
+                <v:shapetype id="_x0000_t75" coordsize="21600,21600" o:spt="75" o:preferrelative="t" path="m@4@5l@4@11@9@11@9@5xe" filled="f" stroked="f">
+                  <v:stroke joinstyle="miter"/>
+                  <v:formulas>
+                    <v:f eqn="if lineDrawn pixelLineWidth 0"/>
+                    <v:f eqn="sum @0 1 0"/>
+                    <v:f eqn="sum 0 0 @1"/>
+                    <v:f eqn="prod @2 1 2"/>
+                    <v:f eqn="prod @3 21600 pixelWidth"/>
+                    <v:f eqn="prod @3 21600 pixelHeight"/>
+                    <v:f eqn="sum @0 0 1"/>
+                    <v:f eqn="prod @6 1 2"/>
+                    <v:f eqn="prod @7 21600 pixelWidth"/>
+                    <v:f eqn="sum @8 21600 0"/>
+                    <v:f eqn="prod @7 21600 pixelHeight"/>
+                    <v:f eqn="sum @10 21600 0"/>
+                  </v:formulas>
+                  <v:path o:extrusionok="f" gradientshapeok="t" o:connecttype="rect"/>
+                  <o:lock v:ext="edit" aspectratio="t"/>
+                </v:shapetype>
+                <v:shape id="Picture 2" o:spid="_x0000_s1027" type="#_x0000_t75" alt="A screen shot of a computer program&#10;&#10;AI-generated content may be incorrect." style="position:absolute;width:29616;height:22294;visibility:visible;mso-wrap-style:square" o:gfxdata="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">
+                  <v:imagedata r:id="rId14" o:title="A screen shot of a computer program&#10;&#10;AI-generated content may be incorrect"/>
+                </v:shape>
+                <v:shape id="Picture 1" o:spid="_x0000_s1028" type="#_x0000_t75" alt="A screen shot of a computer code&#10;&#10;AI-generated content may be incorrect." style="position:absolute;top:22245;width:29616;height:7989;visibility:visible;mso-wrap-style:square" o:gfxdata="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">
+                  <v:imagedata r:id="rId15" o:title="A screen shot of a computer code&#10;&#10;AI-generated content may be incorrect"/>
+                </v:shape>
+                <w10:wrap type="square" anchory="page"/>
+              </v:group>
+            </w:pict>
+          </mc:Fallback>
+        </mc:AlternateContent>
+      </w:r>
+      <w:r>
+        <w:rPr>
+          <w:b/>
+          <w:bCs/>
+        </w:rPr>
+        <w:t xml:space="preserve">Section </w:t>
+      </w:r>
+      <w:r>
+        <w:rPr>
+          <w:b/>
+          <w:bCs/>
+        </w:rPr>
+        <w:t>6: Unit Testing</w:t>
+      </w:r>
     </w:p>
     <w:p>
       <w:pPr>
@@ -2026,6 +2276,138 @@
           <w:bCs/>
         </w:rPr>
       </w:pPr>
+      <w:r>
+        <w:rPr>
+          <w:b/>
+          <w:bCs/>
+          <w:noProof/>
+        </w:rPr>
+        <mc:AlternateContent>
+          <mc:Choice Requires="wps">
+            <w:drawing>
+              <wp:anchor distT="0" distB="0" distL="114300" distR="114300" simplePos="0" relativeHeight="251664384" behindDoc="0" locked="0" layoutInCell="1" allowOverlap="1" wp14:anchorId="5EDE8E08" wp14:editId="33C7EE77">
+                <wp:simplePos x="0" y="0"/>
+                <wp:positionH relativeFrom="column">
+                  <wp:posOffset>3046195</wp:posOffset>
+                </wp:positionH>
+                <wp:positionV relativeFrom="paragraph">
+                  <wp:posOffset>335480</wp:posOffset>
+                </wp:positionV>
+                <wp:extent cx="3394953" cy="972766"/>
+                <wp:effectExtent l="0" t="0" r="8890" b="18415"/>
+                <wp:wrapNone/>
+                <wp:docPr id="1732241120" name="Text Box 11"/>
+                <wp:cNvGraphicFramePr/>
+                <a:graphic xmlns:a="http://schemas.openxmlformats.org/drawingml/2006/main">
+                  <a:graphicData uri="http://schemas.microsoft.com/office/word/2010/wordprocessingShape">
+                    <wps:wsp>
+                      <wps:cNvSpPr txBox="1"/>
+                      <wps:spPr>
+                        <a:xfrm>
+                          <a:off x="0" y="0"/>
+                          <a:ext cx="3394953" cy="972766"/>
+                        </a:xfrm>
+                        <a:prstGeom prst="rect">
+                          <a:avLst/>
+                        </a:prstGeom>
+                        <a:solidFill>
+                          <a:schemeClr val="lt1"/>
+                        </a:solidFill>
+                        <a:ln w="6350">
+                          <a:solidFill>
+                            <a:prstClr val="black"/>
+                          </a:solidFill>
+                        </a:ln>
+                      </wps:spPr>
+                      <wps:txbx>
+                        <w:txbxContent>
+                          <w:p>
+                            <w:r>
+                              <w:t xml:space="preserve">Wrote unit test to test the </w:t>
+                            </w:r>
+                            <w:proofErr w:type="spellStart"/>
+                            <w:r>
+                              <w:t>Try_</w:t>
+                            </w:r>
+                            <w:proofErr w:type="gramStart"/>
+                            <w:r>
+                              <w:t>Load</w:t>
+                            </w:r>
+                            <w:proofErr w:type="spellEnd"/>
+                            <w:r>
+                              <w:t>(</w:t>
+                            </w:r>
+                            <w:proofErr w:type="gramEnd"/>
+                            <w:r>
+                              <w:t xml:space="preserve">) function which is used to import sound and image assets for the game. </w:t>
+                            </w:r>
+                            <w:r>
+                              <w:t>However,</w:t>
+                            </w:r>
+                            <w:r>
+                              <w:t xml:space="preserve"> the music test failed as it appears the function returned None instead of a sound class. </w:t>
+                            </w:r>
+                          </w:p>
+                        </w:txbxContent>
+                      </wps:txbx>
+                      <wps:bodyPr rot="0" spcFirstLastPara="0" vertOverflow="overflow" horzOverflow="overflow" vert="horz" wrap="square" lIns="91440" tIns="45720" rIns="91440" bIns="45720" numCol="1" spcCol="0" rtlCol="0" fromWordArt="0" anchor="t" anchorCtr="0" forceAA="0" compatLnSpc="1">
+                        <a:prstTxWarp prst="textNoShape">
+                          <a:avLst/>
+                        </a:prstTxWarp>
+                        <a:noAutofit/>
+                      </wps:bodyPr>
+                    </wps:wsp>
+                  </a:graphicData>
+                </a:graphic>
+                <wp14:sizeRelV relativeFrom="margin">
+                  <wp14:pctHeight>0</wp14:pctHeight>
+                </wp14:sizeRelV>
+              </wp:anchor>
+            </w:drawing>
+          </mc:Choice>
+          <mc:Fallback>
+            <w:pict>
+              <v:shapetype w14:anchorId="5EDE8E08" id="_x0000_t202" coordsize="21600,21600" o:spt="202" path="m,l,21600r21600,l21600,xe">
+                <v:stroke joinstyle="miter"/>
+                <v:path gradientshapeok="t" o:connecttype="rect"/>
+              </v:shapetype>
+              <v:shape id="Text Box 11" o:spid="_x0000_s1026" type="#_x0000_t202" style="position:absolute;margin-left:239.85pt;margin-top:26.4pt;width:267.3pt;height:76.6pt;z-index:251664384;visibility:visible;mso-wrap-style:square;mso-height-percent:0;mso-wrap-distance-left:9pt;mso-wrap-distance-top:0;mso-wrap-distance-right:9pt;mso-wrap-distance-bottom:0;mso-position-horizontal:absolute;mso-position-horizontal-relative:text;mso-position-vertical:absolute;mso-position-vertical-relative:text;mso-height-percent:0;mso-height-relative:margin;v-text-anchor:top" o:gfxdata="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" fillcolor="white [3201]" strokeweight=".5pt">
+                <v:textbox>
+                  <w:txbxContent>
+                    <w:p>
+                      <w:r>
+                        <w:t xml:space="preserve">Wrote unit test to test the </w:t>
+                      </w:r>
+                      <w:proofErr w:type="spellStart"/>
+                      <w:r>
+                        <w:t>Try_</w:t>
+                      </w:r>
+                      <w:proofErr w:type="gramStart"/>
+                      <w:r>
+                        <w:t>Load</w:t>
+                      </w:r>
+                      <w:proofErr w:type="spellEnd"/>
+                      <w:r>
+                        <w:t>(</w:t>
+                      </w:r>
+                      <w:proofErr w:type="gramEnd"/>
+                      <w:r>
+                        <w:t xml:space="preserve">) function which is used to import sound and image assets for the game. </w:t>
+                      </w:r>
+                      <w:r>
+                        <w:t>However,</w:t>
+                      </w:r>
+                      <w:r>
+                        <w:t xml:space="preserve"> the music test failed as it appears the function returned None instead of a sound class. </w:t>
+                      </w:r>
+                    </w:p>
+                  </w:txbxContent>
+                </v:textbox>
+              </v:shape>
+            </w:pict>
+          </mc:Fallback>
+        </mc:AlternateContent>
+      </w:r>
     </w:p>
     <w:p/>
     <w:p/>
@@ -2034,6 +2416,265 @@
     <w:p/>
     <w:p/>
     <w:p/>
+    <w:p>
+      <w:r>
+        <w:rPr>
+          <w:noProof/>
+        </w:rPr>
+        <mc:AlternateContent>
+          <mc:Choice Requires="wpg">
+            <w:drawing>
+              <wp:anchor distT="0" distB="0" distL="114300" distR="114300" simplePos="0" relativeHeight="251660288" behindDoc="0" locked="0" layoutInCell="1" allowOverlap="1" wp14:anchorId="14EBD709" wp14:editId="45D9C80A">
+                <wp:simplePos x="0" y="0"/>
+                <wp:positionH relativeFrom="column">
+                  <wp:posOffset>-86995</wp:posOffset>
+                </wp:positionH>
+                <wp:positionV relativeFrom="page">
+                  <wp:posOffset>4329430</wp:posOffset>
+                </wp:positionV>
+                <wp:extent cx="3021330" cy="3134995"/>
+                <wp:effectExtent l="0" t="0" r="1270" b="1905"/>
+                <wp:wrapSquare wrapText="bothSides"/>
+                <wp:docPr id="1972403929" name="Group 9"/>
+                <wp:cNvGraphicFramePr/>
+                <a:graphic xmlns:a="http://schemas.openxmlformats.org/drawingml/2006/main">
+                  <a:graphicData uri="http://schemas.microsoft.com/office/word/2010/wordprocessingGroup">
+                    <wpg:wgp>
+                      <wpg:cNvGrpSpPr/>
+                      <wpg:grpSpPr>
+                        <a:xfrm>
+                          <a:off x="0" y="0"/>
+                          <a:ext cx="3021330" cy="3134995"/>
+                          <a:chOff x="0" y="0"/>
+                          <a:chExt cx="3409315" cy="3537502"/>
+                        </a:xfrm>
+                      </wpg:grpSpPr>
+                      <pic:pic xmlns:pic="http://schemas.openxmlformats.org/drawingml/2006/picture">
+                        <pic:nvPicPr>
+                          <pic:cNvPr id="993418889" name="Picture 3" descr="A computer screen shot of text&#10;&#10;AI-generated content may be incorrect."/>
+                          <pic:cNvPicPr>
+                            <a:picLocks noChangeAspect="1"/>
+                          </pic:cNvPicPr>
+                        </pic:nvPicPr>
+                        <pic:blipFill>
+                          <a:blip r:embed="rId16" cstate="print">
+                            <a:extLst>
+                              <a:ext uri="{28A0092B-C50C-407E-A947-70E740481C1C}">
+                                <a14:useLocalDpi xmlns:a14="http://schemas.microsoft.com/office/drawing/2010/main" val="0"/>
+                              </a:ext>
+                            </a:extLst>
+                          </a:blip>
+                          <a:stretch>
+                            <a:fillRect/>
+                          </a:stretch>
+                        </pic:blipFill>
+                        <pic:spPr>
+                          <a:xfrm>
+                            <a:off x="0" y="0"/>
+                            <a:ext cx="3409315" cy="2743200"/>
+                          </a:xfrm>
+                          <a:prstGeom prst="rect">
+                            <a:avLst/>
+                          </a:prstGeom>
+                        </pic:spPr>
+                      </pic:pic>
+                      <pic:pic xmlns:pic="http://schemas.openxmlformats.org/drawingml/2006/picture">
+                        <pic:nvPicPr>
+                          <pic:cNvPr id="1161287005" name="Picture 4" descr="A screen shot of a computer screen&#10;&#10;AI-generated content may be incorrect."/>
+                          <pic:cNvPicPr>
+                            <a:picLocks noChangeAspect="1"/>
+                          </pic:cNvPicPr>
+                        </pic:nvPicPr>
+                        <pic:blipFill>
+                          <a:blip r:embed="rId17">
+                            <a:extLst>
+                              <a:ext uri="{28A0092B-C50C-407E-A947-70E740481C1C}">
+                                <a14:useLocalDpi xmlns:a14="http://schemas.microsoft.com/office/drawing/2010/main" val="0"/>
+                              </a:ext>
+                            </a:extLst>
+                          </a:blip>
+                          <a:stretch>
+                            <a:fillRect/>
+                          </a:stretch>
+                        </pic:blipFill>
+                        <pic:spPr>
+                          <a:xfrm>
+                            <a:off x="0" y="2756452"/>
+                            <a:ext cx="3385185" cy="781050"/>
+                          </a:xfrm>
+                          <a:prstGeom prst="rect">
+                            <a:avLst/>
+                          </a:prstGeom>
+                        </pic:spPr>
+                      </pic:pic>
+                    </wpg:wgp>
+                  </a:graphicData>
+                </a:graphic>
+                <wp14:sizeRelH relativeFrom="margin">
+                  <wp14:pctWidth>0</wp14:pctWidth>
+                </wp14:sizeRelH>
+                <wp14:sizeRelV relativeFrom="margin">
+                  <wp14:pctHeight>0</wp14:pctHeight>
+                </wp14:sizeRelV>
+              </wp:anchor>
+            </w:drawing>
+          </mc:Choice>
+          <mc:Fallback>
+            <w:pict>
+              <v:group w14:anchorId="1E3A6A27" id="Group 9" o:spid="_x0000_s1026" style="position:absolute;margin-left:-6.85pt;margin-top:340.9pt;width:237.9pt;height:246.85pt;z-index:251660288;mso-position-vertical-relative:page;mso-width-relative:margin;mso-height-relative:margin" coordsize="34093,35375" o:gfxdata="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">
+                <v:shape id="Picture 3" o:spid="_x0000_s1027" type="#_x0000_t75" alt="A computer screen shot of text&#10;&#10;AI-generated content may be incorrect." style="position:absolute;width:34093;height:27432;visibility:visible;mso-wrap-style:square" o:gfxdata="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">
+                  <v:imagedata r:id="rId18" o:title="A computer screen shot of text&#10;&#10;AI-generated content may be incorrect"/>
+                </v:shape>
+                <v:shape id="Picture 4" o:spid="_x0000_s1028" type="#_x0000_t75" alt="A screen shot of a computer screen&#10;&#10;AI-generated content may be incorrect." style="position:absolute;top:27564;width:33851;height:7811;visibility:visible;mso-wrap-style:square" o:gfxdata="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">
+                  <v:imagedata r:id="rId19" o:title="A screen shot of a computer screen&#10;&#10;AI-generated content may be incorrect"/>
+                </v:shape>
+                <w10:wrap type="square" anchory="page"/>
+              </v:group>
+            </w:pict>
+          </mc:Fallback>
+        </mc:AlternateContent>
+      </w:r>
+    </w:p>
+    <w:p/>
+    <w:p/>
+    <w:p>
+      <w:r>
+        <w:rPr>
+          <w:b/>
+          <w:bCs/>
+          <w:noProof/>
+        </w:rPr>
+        <mc:AlternateContent>
+          <mc:Choice Requires="wps">
+            <w:drawing>
+              <wp:anchor distT="0" distB="0" distL="114300" distR="114300" simplePos="0" relativeHeight="251666432" behindDoc="0" locked="0" layoutInCell="1" allowOverlap="1" wp14:anchorId="4711C572" wp14:editId="7FB824C9">
+                <wp:simplePos x="0" y="0"/>
+                <wp:positionH relativeFrom="column">
+                  <wp:posOffset>3046195</wp:posOffset>
+                </wp:positionH>
+                <wp:positionV relativeFrom="paragraph">
+                  <wp:posOffset>260150</wp:posOffset>
+                </wp:positionV>
+                <wp:extent cx="3394710" cy="1254868"/>
+                <wp:effectExtent l="0" t="0" r="8890" b="15240"/>
+                <wp:wrapNone/>
+                <wp:docPr id="1936471911" name="Text Box 11"/>
+                <wp:cNvGraphicFramePr/>
+                <a:graphic xmlns:a="http://schemas.openxmlformats.org/drawingml/2006/main">
+                  <a:graphicData uri="http://schemas.microsoft.com/office/word/2010/wordprocessingShape">
+                    <wps:wsp>
+                      <wps:cNvSpPr txBox="1"/>
+                      <wps:spPr>
+                        <a:xfrm>
+                          <a:off x="0" y="0"/>
+                          <a:ext cx="3394710" cy="1254868"/>
+                        </a:xfrm>
+                        <a:prstGeom prst="rect">
+                          <a:avLst/>
+                        </a:prstGeom>
+                        <a:solidFill>
+                          <a:schemeClr val="lt1"/>
+                        </a:solidFill>
+                        <a:ln w="6350">
+                          <a:solidFill>
+                            <a:prstClr val="black"/>
+                          </a:solidFill>
+                        </a:ln>
+                      </wps:spPr>
+                      <wps:txbx>
+                        <w:txbxContent>
+                          <w:p>
+                            <w:r>
+                              <w:t xml:space="preserve">I realised my mistake was that the music section does not return any values instead it loads it into the </w:t>
+                            </w:r>
+                            <w:proofErr w:type="spellStart"/>
+                            <w:proofErr w:type="gramStart"/>
+                            <w:r>
+                              <w:t>pygame.mixer</w:t>
+                            </w:r>
+                            <w:proofErr w:type="spellEnd"/>
+                            <w:proofErr w:type="gramEnd"/>
+                            <w:r>
+                              <w:t xml:space="preserve"> which can then be played. So I tried instead using the </w:t>
+                            </w:r>
+                            <w:proofErr w:type="spellStart"/>
+                            <w:r>
+                              <w:t>pygame.mixer.get_</w:t>
+                            </w:r>
+                            <w:proofErr w:type="gramStart"/>
+                            <w:r>
+                              <w:t>busy</w:t>
+                            </w:r>
+                            <w:proofErr w:type="spellEnd"/>
+                            <w:r>
+                              <w:t>(</w:t>
+                            </w:r>
+                            <w:proofErr w:type="gramEnd"/>
+                            <w:r>
+                              <w:t>) function which checks if the music is playing however this too failed as apparently the music was not playing.</w:t>
+                            </w:r>
+                          </w:p>
+                        </w:txbxContent>
+                      </wps:txbx>
+                      <wps:bodyPr rot="0" spcFirstLastPara="0" vertOverflow="overflow" horzOverflow="overflow" vert="horz" wrap="square" lIns="91440" tIns="45720" rIns="91440" bIns="45720" numCol="1" spcCol="0" rtlCol="0" fromWordArt="0" anchor="t" anchorCtr="0" forceAA="0" compatLnSpc="1">
+                        <a:prstTxWarp prst="textNoShape">
+                          <a:avLst/>
+                        </a:prstTxWarp>
+                        <a:noAutofit/>
+                      </wps:bodyPr>
+                    </wps:wsp>
+                  </a:graphicData>
+                </a:graphic>
+                <wp14:sizeRelV relativeFrom="margin">
+                  <wp14:pctHeight>0</wp14:pctHeight>
+                </wp14:sizeRelV>
+              </wp:anchor>
+            </w:drawing>
+          </mc:Choice>
+          <mc:Fallback>
+            <w:pict>
+              <v:shape w14:anchorId="4711C572" id="_x0000_s1027" type="#_x0000_t202" style="position:absolute;margin-left:239.85pt;margin-top:20.5pt;width:267.3pt;height:98.8pt;z-index:251666432;visibility:visible;mso-wrap-style:square;mso-height-percent:0;mso-wrap-distance-left:9pt;mso-wrap-distance-top:0;mso-wrap-distance-right:9pt;mso-wrap-distance-bottom:0;mso-position-horizontal:absolute;mso-position-horizontal-relative:text;mso-position-vertical:absolute;mso-position-vertical-relative:text;mso-height-percent:0;mso-height-relative:margin;v-text-anchor:top" o:gfxdata="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" fillcolor="white [3201]" strokeweight=".5pt">
+                <v:textbox>
+                  <w:txbxContent>
+                    <w:p>
+                      <w:r>
+                        <w:t xml:space="preserve">I realised my mistake was that the music section does not return any values instead it loads it into the </w:t>
+                      </w:r>
+                      <w:proofErr w:type="spellStart"/>
+                      <w:proofErr w:type="gramStart"/>
+                      <w:r>
+                        <w:t>pygame.mixer</w:t>
+                      </w:r>
+                      <w:proofErr w:type="spellEnd"/>
+                      <w:proofErr w:type="gramEnd"/>
+                      <w:r>
+                        <w:t xml:space="preserve"> which can then be played. So I tried instead using the </w:t>
+                      </w:r>
+                      <w:proofErr w:type="spellStart"/>
+                      <w:r>
+                        <w:t>pygame.mixer.get_</w:t>
+                      </w:r>
+                      <w:proofErr w:type="gramStart"/>
+                      <w:r>
+                        <w:t>busy</w:t>
+                      </w:r>
+                      <w:proofErr w:type="spellEnd"/>
+                      <w:r>
+                        <w:t>(</w:t>
+                      </w:r>
+                      <w:proofErr w:type="gramEnd"/>
+                      <w:r>
+                        <w:t>) function which checks if the music is playing however this too failed as apparently the music was not playing.</w:t>
+                      </w:r>
+                    </w:p>
+                  </w:txbxContent>
+                </v:textbox>
+              </v:shape>
+            </w:pict>
+          </mc:Fallback>
+        </mc:AlternateContent>
+      </w:r>
+    </w:p>
     <w:p/>
     <w:p/>
     <w:p/>
@@ -2041,9 +2682,284 @@
     <w:p/>
     <w:p/>
     <w:p/>
+    <w:p>
+      <w:r>
+        <w:rPr>
+          <w:noProof/>
+        </w:rPr>
+        <mc:AlternateContent>
+          <mc:Choice Requires="wpg">
+            <w:drawing>
+              <wp:anchor distT="0" distB="0" distL="114300" distR="114300" simplePos="0" relativeHeight="251663360" behindDoc="0" locked="0" layoutInCell="1" allowOverlap="1" wp14:anchorId="3AE92666" wp14:editId="72E18B6B">
+                <wp:simplePos x="0" y="0"/>
+                <wp:positionH relativeFrom="column">
+                  <wp:posOffset>-66040</wp:posOffset>
+                </wp:positionH>
+                <wp:positionV relativeFrom="page">
+                  <wp:posOffset>7461925</wp:posOffset>
+                </wp:positionV>
+                <wp:extent cx="2943860" cy="2813050"/>
+                <wp:effectExtent l="0" t="0" r="2540" b="6350"/>
+                <wp:wrapSquare wrapText="bothSides"/>
+                <wp:docPr id="1987584630" name="Group 10"/>
+                <wp:cNvGraphicFramePr/>
+                <a:graphic xmlns:a="http://schemas.openxmlformats.org/drawingml/2006/main">
+                  <a:graphicData uri="http://schemas.microsoft.com/office/word/2010/wordprocessingGroup">
+                    <wpg:wgp>
+                      <wpg:cNvGrpSpPr/>
+                      <wpg:grpSpPr>
+                        <a:xfrm>
+                          <a:off x="0" y="0"/>
+                          <a:ext cx="2943860" cy="2813050"/>
+                          <a:chOff x="0" y="0"/>
+                          <a:chExt cx="2722880" cy="2778739"/>
+                        </a:xfrm>
+                      </wpg:grpSpPr>
+                      <pic:pic xmlns:pic="http://schemas.openxmlformats.org/drawingml/2006/picture">
+                        <pic:nvPicPr>
+                          <pic:cNvPr id="856399134" name="Picture 6" descr="A computer screen shot of text&#10;&#10;AI-generated content may be incorrect."/>
+                          <pic:cNvPicPr>
+                            <a:picLocks noChangeAspect="1"/>
+                          </pic:cNvPicPr>
+                        </pic:nvPicPr>
+                        <pic:blipFill>
+                          <a:blip r:embed="rId20" cstate="print">
+                            <a:extLst>
+                              <a:ext uri="{28A0092B-C50C-407E-A947-70E740481C1C}">
+                                <a14:useLocalDpi xmlns:a14="http://schemas.microsoft.com/office/drawing/2010/main" val="0"/>
+                              </a:ext>
+                            </a:extLst>
+                          </a:blip>
+                          <a:stretch>
+                            <a:fillRect/>
+                          </a:stretch>
+                        </pic:blipFill>
+                        <pic:spPr>
+                          <a:xfrm>
+                            <a:off x="0" y="0"/>
+                            <a:ext cx="2722880" cy="2231390"/>
+                          </a:xfrm>
+                          <a:prstGeom prst="rect">
+                            <a:avLst/>
+                          </a:prstGeom>
+                        </pic:spPr>
+                      </pic:pic>
+                      <pic:pic xmlns:pic="http://schemas.openxmlformats.org/drawingml/2006/picture">
+                        <pic:nvPicPr>
+                          <pic:cNvPr id="1039637642" name="Picture 5" descr="A screen shot of a computer screen&#10;&#10;AI-generated content may be incorrect."/>
+                          <pic:cNvPicPr>
+                            <a:picLocks noChangeAspect="1"/>
+                          </pic:cNvPicPr>
+                        </pic:nvPicPr>
+                        <pic:blipFill>
+                          <a:blip r:embed="rId21">
+                            <a:extLst>
+                              <a:ext uri="{28A0092B-C50C-407E-A947-70E740481C1C}">
+                                <a14:useLocalDpi xmlns:a14="http://schemas.microsoft.com/office/drawing/2010/main" val="0"/>
+                              </a:ext>
+                            </a:extLst>
+                          </a:blip>
+                          <a:stretch>
+                            <a:fillRect/>
+                          </a:stretch>
+                        </pic:blipFill>
+                        <pic:spPr>
+                          <a:xfrm flipV="1">
+                            <a:off x="0" y="2230734"/>
+                            <a:ext cx="2722880" cy="548005"/>
+                          </a:xfrm>
+                          <a:prstGeom prst="rect">
+                            <a:avLst/>
+                          </a:prstGeom>
+                        </pic:spPr>
+                      </pic:pic>
+                    </wpg:wgp>
+                  </a:graphicData>
+                </a:graphic>
+                <wp14:sizeRelH relativeFrom="margin">
+                  <wp14:pctWidth>0</wp14:pctWidth>
+                </wp14:sizeRelH>
+                <wp14:sizeRelV relativeFrom="margin">
+                  <wp14:pctHeight>0</wp14:pctHeight>
+                </wp14:sizeRelV>
+              </wp:anchor>
+            </w:drawing>
+          </mc:Choice>
+          <mc:Fallback>
+            <w:pict>
+              <v:group w14:anchorId="3570C1FB" id="Group 10" o:spid="_x0000_s1026" style="position:absolute;margin-left:-5.2pt;margin-top:587.55pt;width:231.8pt;height:221.5pt;z-index:251663360;mso-position-vertical-relative:page;mso-width-relative:margin;mso-height-relative:margin" coordsize="27228,27787" o:gfxdata="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">
+                <v:shape id="Picture 6" o:spid="_x0000_s1027" type="#_x0000_t75" alt="A computer screen shot of text&#10;&#10;AI-generated content may be incorrect." style="position:absolute;width:27228;height:22313;visibility:visible;mso-wrap-style:square" o:gfxdata="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">
+                  <v:imagedata r:id="rId22" o:title="A computer screen shot of text&#10;&#10;AI-generated content may be incorrect"/>
+                </v:shape>
+                <v:shape id="Picture 5" o:spid="_x0000_s1028" type="#_x0000_t75" alt="A screen shot of a computer screen&#10;&#10;AI-generated content may be incorrect." style="position:absolute;top:22307;width:27228;height:5480;flip:y;visibility:visible;mso-wrap-style:square" o:gfxdata="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">
+                  <v:imagedata r:id="rId23" o:title="A screen shot of a computer screen&#10;&#10;AI-generated content may be incorrect"/>
+                </v:shape>
+                <w10:wrap type="square" anchory="page"/>
+              </v:group>
+            </w:pict>
+          </mc:Fallback>
+        </mc:AlternateContent>
+      </w:r>
+    </w:p>
     <w:p/>
-    <w:p/>
-    <w:p/>
+    <w:p>
+      <w:pPr>
+        <w:ind w:left="720" w:hanging="720"/>
+      </w:pPr>
+    </w:p>
+    <w:p>
+      <w:pPr>
+        <w:ind w:left="720" w:hanging="720"/>
+      </w:pPr>
+      <w:r>
+        <w:rPr>
+          <w:b/>
+          <w:bCs/>
+          <w:noProof/>
+        </w:rPr>
+        <mc:AlternateContent>
+          <mc:Choice Requires="wps">
+            <w:drawing>
+              <wp:anchor distT="0" distB="0" distL="114300" distR="114300" simplePos="0" relativeHeight="251668480" behindDoc="0" locked="0" layoutInCell="1" allowOverlap="1" wp14:anchorId="55A5C71D" wp14:editId="5D2ACE78">
+                <wp:simplePos x="0" y="0"/>
+                <wp:positionH relativeFrom="column">
+                  <wp:posOffset>3048000</wp:posOffset>
+                </wp:positionH>
+                <wp:positionV relativeFrom="paragraph">
+                  <wp:posOffset>289638</wp:posOffset>
+                </wp:positionV>
+                <wp:extent cx="3394710" cy="1254868"/>
+                <wp:effectExtent l="0" t="0" r="8890" b="15240"/>
+                <wp:wrapNone/>
+                <wp:docPr id="1389569853" name="Text Box 11"/>
+                <wp:cNvGraphicFramePr/>
+                <a:graphic xmlns:a="http://schemas.openxmlformats.org/drawingml/2006/main">
+                  <a:graphicData uri="http://schemas.microsoft.com/office/word/2010/wordprocessingShape">
+                    <wps:wsp>
+                      <wps:cNvSpPr txBox="1"/>
+                      <wps:spPr>
+                        <a:xfrm>
+                          <a:off x="0" y="0"/>
+                          <a:ext cx="3394710" cy="1254868"/>
+                        </a:xfrm>
+                        <a:prstGeom prst="rect">
+                          <a:avLst/>
+                        </a:prstGeom>
+                        <a:solidFill>
+                          <a:schemeClr val="lt1"/>
+                        </a:solidFill>
+                        <a:ln w="6350">
+                          <a:solidFill>
+                            <a:prstClr val="black"/>
+                          </a:solidFill>
+                        </a:ln>
+                      </wps:spPr>
+                      <wps:txbx>
+                        <w:txbxContent>
+                          <w:p>
+                            <w:r>
+                              <w:t xml:space="preserve">I </w:t>
+                            </w:r>
+                            <w:r>
+                              <w:t xml:space="preserve">once again realised my silly mistake was that I used </w:t>
+                            </w:r>
+                            <w:proofErr w:type="spellStart"/>
+                            <w:r>
+                              <w:t>pygame.mixer.get_</w:t>
+                            </w:r>
+                            <w:proofErr w:type="gramStart"/>
+                            <w:r>
+                              <w:t>busy</w:t>
+                            </w:r>
+                            <w:proofErr w:type="spellEnd"/>
+                            <w:r>
+                              <w:t>(</w:t>
+                            </w:r>
+                            <w:proofErr w:type="gramEnd"/>
+                            <w:r>
+                              <w:t xml:space="preserve">) instead of </w:t>
+                            </w:r>
+                            <w:proofErr w:type="spellStart"/>
+                            <w:r>
+                              <w:t>pygame.mixer.music.get_busy</w:t>
+                            </w:r>
+                            <w:proofErr w:type="spellEnd"/>
+                            <w:r>
+                              <w:t>(). Fixing this issue allowed for the proper testing of the function and the function was able to pass all three tests smoothly</w:t>
+                            </w:r>
+                          </w:p>
+                        </w:txbxContent>
+                      </wps:txbx>
+                      <wps:bodyPr rot="0" spcFirstLastPara="0" vertOverflow="overflow" horzOverflow="overflow" vert="horz" wrap="square" lIns="91440" tIns="45720" rIns="91440" bIns="45720" numCol="1" spcCol="0" rtlCol="0" fromWordArt="0" anchor="t" anchorCtr="0" forceAA="0" compatLnSpc="1">
+                        <a:prstTxWarp prst="textNoShape">
+                          <a:avLst/>
+                        </a:prstTxWarp>
+                        <a:noAutofit/>
+                      </wps:bodyPr>
+                    </wps:wsp>
+                  </a:graphicData>
+                </a:graphic>
+                <wp14:sizeRelV relativeFrom="margin">
+                  <wp14:pctHeight>0</wp14:pctHeight>
+                </wp14:sizeRelV>
+              </wp:anchor>
+            </w:drawing>
+          </mc:Choice>
+          <mc:Fallback>
+            <w:pict>
+              <v:shape w14:anchorId="55A5C71D" id="_x0000_s1028" type="#_x0000_t202" style="position:absolute;left:0;text-align:left;margin-left:240pt;margin-top:22.8pt;width:267.3pt;height:98.8pt;z-index:251668480;visibility:visible;mso-wrap-style:square;mso-height-percent:0;mso-wrap-distance-left:9pt;mso-wrap-distance-top:0;mso-wrap-distance-right:9pt;mso-wrap-distance-bottom:0;mso-position-horizontal:absolute;mso-position-horizontal-relative:text;mso-position-vertical:absolute;mso-position-vertical-relative:text;mso-height-percent:0;mso-height-relative:margin;v-text-anchor:top" o:gfxdata="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" fillcolor="white [3201]" strokeweight=".5pt">
+                <v:textbox>
+                  <w:txbxContent>
+                    <w:p>
+                      <w:r>
+                        <w:t xml:space="preserve">I </w:t>
+                      </w:r>
+                      <w:r>
+                        <w:t xml:space="preserve">once again realised my silly mistake was that I used </w:t>
+                      </w:r>
+                      <w:proofErr w:type="spellStart"/>
+                      <w:r>
+                        <w:t>pygame.mixer.get_</w:t>
+                      </w:r>
+                      <w:proofErr w:type="gramStart"/>
+                      <w:r>
+                        <w:t>busy</w:t>
+                      </w:r>
+                      <w:proofErr w:type="spellEnd"/>
+                      <w:r>
+                        <w:t>(</w:t>
+                      </w:r>
+                      <w:proofErr w:type="gramEnd"/>
+                      <w:r>
+                        <w:t xml:space="preserve">) instead of </w:t>
+                      </w:r>
+                      <w:proofErr w:type="spellStart"/>
+                      <w:r>
+                        <w:t>pygame.mixer.music.get_busy</w:t>
+                      </w:r>
+                      <w:proofErr w:type="spellEnd"/>
+                      <w:r>
+                        <w:t>(). Fixing this issue allowed for the proper testing of the function and the function was able to pass all three tests smoothly</w:t>
+                      </w:r>
+                    </w:p>
+                  </w:txbxContent>
+                </v:textbox>
+              </v:shape>
+            </w:pict>
+          </mc:Fallback>
+        </mc:AlternateContent>
+      </w:r>
+    </w:p>
+    <w:p>
+      <w:pPr>
+        <w:ind w:left="720" w:hanging="720"/>
+      </w:pPr>
+    </w:p>
+    <w:p>
+      <w:pPr>
+        <w:ind w:left="720" w:hanging="720"/>
+      </w:pPr>
+    </w:p>
     <w:p/>
     <w:p/>
     <w:p/>
@@ -2079,6 +2995,7 @@
         <w:t>: Maintenance Refactor Task</w:t>
       </w:r>
     </w:p>
+    <w:p/>
     <w:p>
       <w:r>
         <w:t>Choose one function from your project that is complex or repetitive. Rewrite it following best practices: single responsibility, clear naming, and comments.</w:t>
@@ -2457,6 +3374,9 @@
         <w:gridCol w:w="9016"/>
       </w:tblGrid>
       <w:tr>
+        <w:trPr>
+          <w:trHeight w:val="3600"/>
+        </w:trPr>
         <w:tc>
           <w:tcPr>
             <w:tcW w:w="9016" w:type="dxa"/>
@@ -2696,15 +3616,16 @@
       <w:r>
         <w:t xml:space="preserve"> Removed redundant ‘if’ statements causing clutter, simplified logic and made overall method much </w:t>
       </w:r>
-      <w:proofErr w:type="gramStart"/>
-      <w:r>
-        <w:t>more clear and succinct</w:t>
-      </w:r>
-      <w:proofErr w:type="gramEnd"/>
+      <w:r>
+        <w:t>clearer and more succinct</w:t>
+      </w:r>
       <w:r>
         <w:t xml:space="preserve"> which in future will allow for easier debugging and maintenance. </w:t>
       </w:r>
     </w:p>
+    <w:p/>
+    <w:p/>
+    <w:p/>
     <w:p/>
     <w:p/>
     <w:p>
@@ -2719,7 +3640,6 @@
           <w:b/>
           <w:bCs/>
         </w:rPr>
-        <w:lastRenderedPageBreak/>
         <w:t>Reflection</w:t>
       </w:r>
     </w:p>
@@ -2730,30 +3650,16 @@
     </w:p>
     <w:p>
       <w:r>
-        <w:rPr>
-          <w:noProof/>
-        </w:rPr>
-        <w:pict w14:anchorId="43E45496">
-          <v:rect id="_x0000_i1026" alt="" style="width:451.3pt;height:.05pt;mso-width-percent:0;mso-height-percent:0;mso-width-percent:0;mso-height-percent:0" o:hralign="center" o:hrstd="t" o:hr="t" fillcolor="#a0a0a0" stroked="f"/>
-        </w:pict>
-      </w:r>
-    </w:p>
-    <w:p>
-      <w:r>
-        <w:rPr>
-          <w:noProof/>
-        </w:rPr>
-        <w:pict w14:anchorId="298DC467">
-          <v:rect id="_x0000_i1025" alt="" style="width:451.3pt;height:.05pt;mso-width-percent:0;mso-height-percent:0;mso-width-percent:0;mso-height-percent:0" o:hralign="center" o:hrstd="t" o:hr="t" fillcolor="#a0a0a0" stroked="f"/>
-        </w:pict>
+        <w:t>Overall, the various testing methods and peer feedback allowed me to ensure the reliability and correctness of my methods, functions and algorithms of my program ensuring that as I develop the program further and expand it there will not be any missed bugs from older algorithms. The peer testing also gave me an insight into my intended target audience of year 12s in my cohort (aka young adults) and helped ensure that I was on the right track with my game ensuring users would enjoy it while she also assisted to test my game as well.</w:t>
       </w:r>
     </w:p>
     <w:p/>
+    <w:p/>
     <w:sectPr>
-      <w:headerReference w:type="default" r:id="rId11"/>
-      <w:footerReference w:type="default" r:id="rId12"/>
+      <w:headerReference w:type="default" r:id="rId24"/>
+      <w:footerReference w:type="default" r:id="rId25"/>
       <w:pgSz w:w="11906" w:h="16838"/>
-      <w:pgMar w:top="1440" w:right="1440" w:bottom="1440" w:left="1440" w:header="708" w:footer="708" w:gutter="0"/>
+      <w:pgMar w:top="357" w:right="369" w:bottom="816" w:left="357" w:header="708" w:footer="708" w:gutter="0"/>
       <w:cols w:space="708"/>
       <w:docGrid w:linePitch="360"/>
     </w:sectPr>
@@ -4092,6 +4998,29 @@
       </w:tblBorders>
     </w:tblPr>
   </w:style>
+  <w:style w:type="character" w:styleId="Hyperlink">
+    <w:name w:val="Hyperlink"/>
+    <w:basedOn w:val="DefaultParagraphFont"/>
+    <w:uiPriority w:val="99"/>
+    <w:unhideWhenUsed/>
+    <w:rsid w:val="00B82478"/>
+    <w:rPr>
+      <w:color w:val="467886" w:themeColor="hyperlink"/>
+      <w:u w:val="single"/>
+    </w:rPr>
+  </w:style>
+  <w:style w:type="character" w:styleId="UnresolvedMention">
+    <w:name w:val="Unresolved Mention"/>
+    <w:basedOn w:val="DefaultParagraphFont"/>
+    <w:uiPriority w:val="99"/>
+    <w:semiHidden/>
+    <w:unhideWhenUsed/>
+    <w:rsid w:val="00B82478"/>
+    <w:rPr>
+      <w:color w:val="605E5C"/>
+      <w:shd w:val="clear" w:color="auto" w:fill="E1DFDD"/>
+    </w:rPr>
+  </w:style>
 </w:styles>
 </file>
 

</xml_diff>